<commit_message>
fix: finalisasi fitur generate stiker, perbaikan tag template word, dan sinkronisasi form vue
</commit_message>
<xml_diff>
--- a/pracindo_backend_v1/fitur/templates/cv_besar/stiker_cv_besar_AAAA.docx
+++ b/pracindo_backend_v1/fitur/templates/cv_besar/stiker_cv_besar_AAAA.docx
@@ -158,6 +158,16 @@
                                         <w:sz w:val="96"/>
                                         <w:szCs w:val="96"/>
                                       </w:rPr>
+                                      <w:t>{{slot1_nama}}</w:t>
+                                    </w:r>
+                                    <w:r>
+                                      <w:rPr>
+                                        <w:rFonts w:ascii="Aptos Black" w:hAnsi="Aptos Black"/>
+                                        <w:b/>
+                                        <w:bCs/>
+                                        <w:sz w:val="96"/>
+                                        <w:szCs w:val="96"/>
+                                      </w:rPr>
                                       <w:fldChar w:fldCharType="begin"/>
                                     </w:r>
                                     <w:r>
@@ -268,15 +278,7 @@
                                         <w:sz w:val="48"/>
                                         <w:szCs w:val="48"/>
                                       </w:rPr>
-                                      <w:t xml:space="preserve"> </w:t>
-                                    </w:r>
-                                    <w:r>
-                                      <w:rPr>
-                                        <w:b/>
-                                        <w:sz w:val="48"/>
-                                        <w:szCs w:val="48"/>
-                                      </w:rPr>
-                                      <w:t>{{ slot1_tipe }}</w:t>
+                                      <w:t>{{slot1_tipe}}</w:t>
                                     </w:r>
                                     <w:r>
                                       <w:rPr>
@@ -342,15 +344,7 @@
                                         <w:sz w:val="48"/>
                                         <w:szCs w:val="48"/>
                                       </w:rPr>
-                                      <w:t xml:space="preserve"> </w:t>
-                                    </w:r>
-                                    <w:r>
-                                      <w:rPr>
-                                        <w:b/>
-                                        <w:sz w:val="48"/>
-                                        <w:szCs w:val="48"/>
-                                      </w:rPr>
-                                      <w:t>{{ slot1_lot }}</w:t>
+                                      <w:t>{{slot1_lot}}</w:t>
                                     </w:r>
                                     <w:r>
                                       <w:rPr>
@@ -416,15 +410,7 @@
                                         <w:sz w:val="48"/>
                                         <w:szCs w:val="48"/>
                                       </w:rPr>
-                                      <w:t xml:space="preserve"> </w:t>
-                                    </w:r>
-                                    <w:r>
-                                      <w:rPr>
-                                        <w:b/>
-                                        <w:sz w:val="48"/>
-                                        <w:szCs w:val="48"/>
-                                      </w:rPr>
-                                      <w:t>{{ slot1_net }}</w:t>
+                                      <w:t>{{slot1_net}}</w:t>
                                     </w:r>
                                     <w:r>
                                       <w:rPr>
@@ -453,17 +439,7 @@
                                   </w:p>
                                   <w:p>
                                     <w:pPr>
-                                      <w:spacing w:after="120" w:line="240" w:lineRule="auto"/>
-                                      <w:jc w:val="center"/>
-                                      <w:rPr>
-                                        <w:sz w:val="18"/>
-                                        <w:szCs w:val="18"/>
-                                      </w:rPr>
-                                    </w:pPr>
-                                  </w:p>
-                                  <w:p>
-                                    <w:pPr>
-                                      <w:spacing w:after="120" w:line="240" w:lineRule="auto"/>
+                                      <w:spacing w:after="120" w:line="360" w:lineRule="auto"/>
                                       <w:jc w:val="center"/>
                                       <w:rPr>
                                         <w:sz w:val="18"/>
@@ -646,6 +622,16 @@
                                   <w:sz w:val="96"/>
                                   <w:szCs w:val="96"/>
                                 </w:rPr>
+                                <w:t>{{slot1_nama}}</w:t>
+                              </w:r>
+                              <w:r>
+                                <w:rPr>
+                                  <w:rFonts w:ascii="Aptos Black" w:hAnsi="Aptos Black"/>
+                                  <w:b/>
+                                  <w:bCs/>
+                                  <w:sz w:val="96"/>
+                                  <w:szCs w:val="96"/>
+                                </w:rPr>
                                 <w:fldChar w:fldCharType="begin"/>
                               </w:r>
                               <w:r>
@@ -756,15 +742,7 @@
                                   <w:sz w:val="48"/>
                                   <w:szCs w:val="48"/>
                                 </w:rPr>
-                                <w:t xml:space="preserve"> </w:t>
-                              </w:r>
-                              <w:r>
-                                <w:rPr>
-                                  <w:b/>
-                                  <w:sz w:val="48"/>
-                                  <w:szCs w:val="48"/>
-                                </w:rPr>
-                                <w:t>{{ slot1_tipe }}</w:t>
+                                <w:t>{{slot1_tipe}}</w:t>
                               </w:r>
                               <w:r>
                                 <w:rPr>
@@ -830,15 +808,7 @@
                                   <w:sz w:val="48"/>
                                   <w:szCs w:val="48"/>
                                 </w:rPr>
-                                <w:t xml:space="preserve"> </w:t>
-                              </w:r>
-                              <w:r>
-                                <w:rPr>
-                                  <w:b/>
-                                  <w:sz w:val="48"/>
-                                  <w:szCs w:val="48"/>
-                                </w:rPr>
-                                <w:t>{{ slot1_lot }}</w:t>
+                                <w:t>{{slot1_lot}}</w:t>
                               </w:r>
                               <w:r>
                                 <w:rPr>
@@ -904,15 +874,7 @@
                                   <w:sz w:val="48"/>
                                   <w:szCs w:val="48"/>
                                 </w:rPr>
-                                <w:t xml:space="preserve"> </w:t>
-                              </w:r>
-                              <w:r>
-                                <w:rPr>
-                                  <w:b/>
-                                  <w:sz w:val="48"/>
-                                  <w:szCs w:val="48"/>
-                                </w:rPr>
-                                <w:t>{{ slot1_net }}</w:t>
+                                <w:t>{{slot1_net}}</w:t>
                               </w:r>
                               <w:r>
                                 <w:rPr>
@@ -941,17 +903,7 @@
                             </w:p>
                             <w:p>
                               <w:pPr>
-                                <w:spacing w:after="120" w:line="240" w:lineRule="auto"/>
-                                <w:jc w:val="center"/>
-                                <w:rPr>
-                                  <w:sz w:val="18"/>
-                                  <w:szCs w:val="18"/>
-                                </w:rPr>
-                              </w:pPr>
-                            </w:p>
-                            <w:p>
-                              <w:pPr>
-                                <w:spacing w:after="120" w:line="240" w:lineRule="auto"/>
+                                <w:spacing w:after="120" w:line="360" w:lineRule="auto"/>
                                 <w:jc w:val="center"/>
                                 <w:rPr>
                                   <w:sz w:val="18"/>
@@ -1110,6 +1062,16 @@
                                         <w:sz w:val="96"/>
                                         <w:szCs w:val="96"/>
                                       </w:rPr>
+                                      <w:t>{{slot1_nama}}</w:t>
+                                    </w:r>
+                                    <w:r>
+                                      <w:rPr>
+                                        <w:rFonts w:ascii="Aptos Black" w:hAnsi="Aptos Black"/>
+                                        <w:b/>
+                                        <w:bCs/>
+                                        <w:sz w:val="96"/>
+                                        <w:szCs w:val="96"/>
+                                      </w:rPr>
                                       <w:fldChar w:fldCharType="begin"/>
                                     </w:r>
                                     <w:r>
@@ -1220,15 +1182,7 @@
                                         <w:sz w:val="48"/>
                                         <w:szCs w:val="48"/>
                                       </w:rPr>
-                                      <w:t xml:space="preserve"> </w:t>
-                                    </w:r>
-                                    <w:r>
-                                      <w:rPr>
-                                        <w:b/>
-                                        <w:sz w:val="48"/>
-                                        <w:szCs w:val="48"/>
-                                      </w:rPr>
-                                      <w:t>{{ slot1_tipe }}</w:t>
+                                      <w:t>{{slot1_tipe}}</w:t>
                                     </w:r>
                                     <w:r>
                                       <w:rPr>
@@ -1294,15 +1248,7 @@
                                         <w:sz w:val="48"/>
                                         <w:szCs w:val="48"/>
                                       </w:rPr>
-                                      <w:t xml:space="preserve"> </w:t>
-                                    </w:r>
-                                    <w:r>
-                                      <w:rPr>
-                                        <w:b/>
-                                        <w:sz w:val="48"/>
-                                        <w:szCs w:val="48"/>
-                                      </w:rPr>
-                                      <w:t>{{ slot1_lot }}</w:t>
+                                      <w:t>{{slot1_lot}}</w:t>
                                     </w:r>
                                     <w:r>
                                       <w:rPr>
@@ -1368,15 +1314,7 @@
                                         <w:sz w:val="48"/>
                                         <w:szCs w:val="48"/>
                                       </w:rPr>
-                                      <w:t xml:space="preserve"> </w:t>
-                                    </w:r>
-                                    <w:r>
-                                      <w:rPr>
-                                        <w:b/>
-                                        <w:sz w:val="48"/>
-                                        <w:szCs w:val="48"/>
-                                      </w:rPr>
-                                      <w:t>{{ slot1_net }}</w:t>
+                                      <w:t>{{slot1_net}}</w:t>
                                     </w:r>
                                     <w:r>
                                       <w:rPr>
@@ -1405,7 +1343,7 @@
                                   </w:p>
                                   <w:p>
                                     <w:pPr>
-                                      <w:spacing w:after="120" w:line="240" w:lineRule="auto"/>
+                                      <w:spacing w:after="120" w:line="360" w:lineRule="auto"/>
                                       <w:jc w:val="center"/>
                                       <w:rPr>
                                         <w:sz w:val="18"/>
@@ -1588,6 +1526,16 @@
                                   <w:sz w:val="96"/>
                                   <w:szCs w:val="96"/>
                                 </w:rPr>
+                                <w:t>{{slot1_nama}}</w:t>
+                              </w:r>
+                              <w:r>
+                                <w:rPr>
+                                  <w:rFonts w:ascii="Aptos Black" w:hAnsi="Aptos Black"/>
+                                  <w:b/>
+                                  <w:bCs/>
+                                  <w:sz w:val="96"/>
+                                  <w:szCs w:val="96"/>
+                                </w:rPr>
                                 <w:fldChar w:fldCharType="begin"/>
                               </w:r>
                               <w:r>
@@ -1698,15 +1646,7 @@
                                   <w:sz w:val="48"/>
                                   <w:szCs w:val="48"/>
                                 </w:rPr>
-                                <w:t xml:space="preserve"> </w:t>
-                              </w:r>
-                              <w:r>
-                                <w:rPr>
-                                  <w:b/>
-                                  <w:sz w:val="48"/>
-                                  <w:szCs w:val="48"/>
-                                </w:rPr>
-                                <w:t>{{ slot1_tipe }}</w:t>
+                                <w:t>{{slot1_tipe}}</w:t>
                               </w:r>
                               <w:r>
                                 <w:rPr>
@@ -1772,15 +1712,7 @@
                                   <w:sz w:val="48"/>
                                   <w:szCs w:val="48"/>
                                 </w:rPr>
-                                <w:t xml:space="preserve"> </w:t>
-                              </w:r>
-                              <w:r>
-                                <w:rPr>
-                                  <w:b/>
-                                  <w:sz w:val="48"/>
-                                  <w:szCs w:val="48"/>
-                                </w:rPr>
-                                <w:t>{{ slot1_lot }}</w:t>
+                                <w:t>{{slot1_lot}}</w:t>
                               </w:r>
                               <w:r>
                                 <w:rPr>
@@ -1846,15 +1778,7 @@
                                   <w:sz w:val="48"/>
                                   <w:szCs w:val="48"/>
                                 </w:rPr>
-                                <w:t xml:space="preserve"> </w:t>
-                              </w:r>
-                              <w:r>
-                                <w:rPr>
-                                  <w:b/>
-                                  <w:sz w:val="48"/>
-                                  <w:szCs w:val="48"/>
-                                </w:rPr>
-                                <w:t>{{ slot1_net }}</w:t>
+                                <w:t>{{slot1_net}}</w:t>
                               </w:r>
                               <w:r>
                                 <w:rPr>
@@ -1883,7 +1807,7 @@
                             </w:p>
                             <w:p>
                               <w:pPr>
-                                <w:spacing w:after="120" w:line="240" w:lineRule="auto"/>
+                                <w:spacing w:after="120" w:line="360" w:lineRule="auto"/>
                                 <w:jc w:val="center"/>
                                 <w:rPr>
                                   <w:sz w:val="18"/>
@@ -2042,6 +1966,16 @@
                                         <w:sz w:val="96"/>
                                         <w:szCs w:val="96"/>
                                       </w:rPr>
+                                      <w:t>{{slot1_nama}}</w:t>
+                                    </w:r>
+                                    <w:r>
+                                      <w:rPr>
+                                        <w:rFonts w:ascii="Aptos Black" w:hAnsi="Aptos Black"/>
+                                        <w:b/>
+                                        <w:bCs/>
+                                        <w:sz w:val="96"/>
+                                        <w:szCs w:val="96"/>
+                                      </w:rPr>
                                       <w:fldChar w:fldCharType="begin"/>
                                     </w:r>
                                     <w:r>
@@ -2152,15 +2086,7 @@
                                         <w:sz w:val="48"/>
                                         <w:szCs w:val="48"/>
                                       </w:rPr>
-                                      <w:t xml:space="preserve"> </w:t>
-                                    </w:r>
-                                    <w:r>
-                                      <w:rPr>
-                                        <w:b/>
-                                        <w:sz w:val="48"/>
-                                        <w:szCs w:val="48"/>
-                                      </w:rPr>
-                                      <w:t>{{ slot1_tipe }}</w:t>
+                                      <w:t>{{slot1_tipe}}</w:t>
                                     </w:r>
                                     <w:r>
                                       <w:rPr>
@@ -2226,15 +2152,7 @@
                                         <w:sz w:val="48"/>
                                         <w:szCs w:val="48"/>
                                       </w:rPr>
-                                      <w:t xml:space="preserve"> </w:t>
-                                    </w:r>
-                                    <w:r>
-                                      <w:rPr>
-                                        <w:b/>
-                                        <w:sz w:val="48"/>
-                                        <w:szCs w:val="48"/>
-                                      </w:rPr>
-                                      <w:t>{{ slot1_lot }}</w:t>
+                                      <w:t>{{slot1_lot}}</w:t>
                                     </w:r>
                                     <w:r>
                                       <w:rPr>
@@ -2300,15 +2218,7 @@
                                         <w:sz w:val="48"/>
                                         <w:szCs w:val="48"/>
                                       </w:rPr>
-                                      <w:t xml:space="preserve"> </w:t>
-                                    </w:r>
-                                    <w:r>
-                                      <w:rPr>
-                                        <w:b/>
-                                        <w:sz w:val="48"/>
-                                        <w:szCs w:val="48"/>
-                                      </w:rPr>
-                                      <w:t>{{ slot1_net }}</w:t>
+                                      <w:t>{{slot1_net}}</w:t>
                                     </w:r>
                                     <w:r>
                                       <w:rPr>
@@ -2337,7 +2247,7 @@
                                   </w:p>
                                   <w:p>
                                     <w:pPr>
-                                      <w:spacing w:after="120" w:line="240" w:lineRule="auto"/>
+                                      <w:spacing w:after="120" w:line="360" w:lineRule="auto"/>
                                       <w:jc w:val="center"/>
                                       <w:rPr>
                                         <w:sz w:val="18"/>
@@ -2520,6 +2430,16 @@
                                   <w:sz w:val="96"/>
                                   <w:szCs w:val="96"/>
                                 </w:rPr>
+                                <w:t>{{slot1_nama}}</w:t>
+                              </w:r>
+                              <w:r>
+                                <w:rPr>
+                                  <w:rFonts w:ascii="Aptos Black" w:hAnsi="Aptos Black"/>
+                                  <w:b/>
+                                  <w:bCs/>
+                                  <w:sz w:val="96"/>
+                                  <w:szCs w:val="96"/>
+                                </w:rPr>
                                 <w:fldChar w:fldCharType="begin"/>
                               </w:r>
                               <w:r>
@@ -2630,15 +2550,7 @@
                                   <w:sz w:val="48"/>
                                   <w:szCs w:val="48"/>
                                 </w:rPr>
-                                <w:t xml:space="preserve"> </w:t>
-                              </w:r>
-                              <w:r>
-                                <w:rPr>
-                                  <w:b/>
-                                  <w:sz w:val="48"/>
-                                  <w:szCs w:val="48"/>
-                                </w:rPr>
-                                <w:t>{{ slot1_tipe }}</w:t>
+                                <w:t>{{slot1_tipe}}</w:t>
                               </w:r>
                               <w:r>
                                 <w:rPr>
@@ -2704,15 +2616,7 @@
                                   <w:sz w:val="48"/>
                                   <w:szCs w:val="48"/>
                                 </w:rPr>
-                                <w:t xml:space="preserve"> </w:t>
-                              </w:r>
-                              <w:r>
-                                <w:rPr>
-                                  <w:b/>
-                                  <w:sz w:val="48"/>
-                                  <w:szCs w:val="48"/>
-                                </w:rPr>
-                                <w:t>{{ slot1_lot }}</w:t>
+                                <w:t>{{slot1_lot}}</w:t>
                               </w:r>
                               <w:r>
                                 <w:rPr>
@@ -2778,15 +2682,7 @@
                                   <w:sz w:val="48"/>
                                   <w:szCs w:val="48"/>
                                 </w:rPr>
-                                <w:t xml:space="preserve"> </w:t>
-                              </w:r>
-                              <w:r>
-                                <w:rPr>
-                                  <w:b/>
-                                  <w:sz w:val="48"/>
-                                  <w:szCs w:val="48"/>
-                                </w:rPr>
-                                <w:t>{{ slot1_net }}</w:t>
+                                <w:t>{{slot1_net}}</w:t>
                               </w:r>
                               <w:r>
                                 <w:rPr>
@@ -2815,7 +2711,7 @@
                             </w:p>
                             <w:p>
                               <w:pPr>
-                                <w:spacing w:after="120" w:line="240" w:lineRule="auto"/>
+                                <w:spacing w:after="120" w:line="360" w:lineRule="auto"/>
                                 <w:jc w:val="center"/>
                                 <w:rPr>
                                   <w:sz w:val="18"/>
@@ -2974,6 +2870,16 @@
                                         <w:sz w:val="96"/>
                                         <w:szCs w:val="96"/>
                                       </w:rPr>
+                                      <w:t>{{slot1_nama}}</w:t>
+                                    </w:r>
+                                    <w:r>
+                                      <w:rPr>
+                                        <w:rFonts w:ascii="Aptos Black" w:hAnsi="Aptos Black"/>
+                                        <w:b/>
+                                        <w:bCs/>
+                                        <w:sz w:val="96"/>
+                                        <w:szCs w:val="96"/>
+                                      </w:rPr>
                                       <w:fldChar w:fldCharType="begin"/>
                                     </w:r>
                                     <w:r>
@@ -3084,15 +2990,7 @@
                                         <w:sz w:val="48"/>
                                         <w:szCs w:val="48"/>
                                       </w:rPr>
-                                      <w:t xml:space="preserve"> </w:t>
-                                    </w:r>
-                                    <w:r>
-                                      <w:rPr>
-                                        <w:b/>
-                                        <w:sz w:val="48"/>
-                                        <w:szCs w:val="48"/>
-                                      </w:rPr>
-                                      <w:t>{{ slot1_tipe }}</w:t>
+                                      <w:t>{{slot1_tipe}}</w:t>
                                     </w:r>
                                     <w:r>
                                       <w:rPr>
@@ -3158,7 +3056,65 @@
                                         <w:sz w:val="48"/>
                                         <w:szCs w:val="48"/>
                                       </w:rPr>
-                                      <w:t xml:space="preserve"> </w:t>
+                                      <w:t>{{slot1_lot}}</w:t>
+                                    </w:r>
+                                    <w:r>
+                                      <w:rPr>
+                                        <w:b/>
+                                        <w:sz w:val="32"/>
+                                        <w:szCs w:val="32"/>
+                                      </w:rPr>
+                                      <w:t>.......................................</w:t>
+                                    </w:r>
+                                    <w:r>
+                                      <w:rPr>
+                                        <w:b/>
+                                        <w:sz w:val="32"/>
+                                        <w:szCs w:val="32"/>
+                                      </w:rPr>
+                                      <w:t>..............</w:t>
+                                    </w:r>
+                                    <w:r>
+                                      <w:rPr>
+                                        <w:b/>
+                                        <w:sz w:val="32"/>
+                                        <w:szCs w:val="32"/>
+                                      </w:rPr>
+                                      <w:t>.</w:t>
+                                    </w:r>
+                                  </w:p>
+                                  <w:p>
+                                    <w:pPr>
+                                      <w:spacing w:line="240" w:lineRule="auto"/>
+                                      <w:rPr>
+                                        <w:b/>
+                                        <w:sz w:val="32"/>
+                                        <w:szCs w:val="32"/>
+                                      </w:rPr>
+                                    </w:pPr>
+                                    <w:r>
+                                      <w:rPr>
+                                        <w:b/>
+                                        <w:sz w:val="32"/>
+                                        <w:szCs w:val="32"/>
+                                      </w:rPr>
+                                      <w:t>NET  : ................................</w:t>
+                                    </w:r>
+                                    <w:r>
+                                      <w:rPr>
+                                        <w:b/>
+                                        <w:sz w:val="32"/>
+                                        <w:szCs w:val="32"/>
+                                      </w:rPr>
+                                      <w:t>................</w:t>
+                                    </w:r>
+                                    <w:r>
+                                      <w:rPr>
+                                        <w:b/>
+                                        <w:sz w:val="32"/>
+                                        <w:szCs w:val="32"/>
+                                      </w:rPr>
+                                      <w:t>.....</w:t>
                                     </w:r>
                                     <w:r>
                                       <w:rPr>
@@ -3166,7 +3122,49 @@
                                         <w:sz w:val="48"/>
                                         <w:szCs w:val="48"/>
                                       </w:rPr>
-                                      <w:t>{{ slot1_lot }}</w:t>
+                                      <w:t>{{slot1_net}}</w:t>
+                                    </w:r>
+                                    <w:r>
+                                      <w:rPr>
+                                        <w:b/>
+                                        <w:sz w:val="32"/>
+                                        <w:szCs w:val="32"/>
+                                      </w:rPr>
+                                      <w:t>...........</w:t>
+                                    </w:r>
+                                    <w:r>
+                                      <w:rPr>
+                                        <w:b/>
+                                        <w:sz w:val="32"/>
+                                        <w:szCs w:val="32"/>
+                                      </w:rPr>
+                                      <w:t>.............</w:t>
+                                    </w:r>
+                                    <w:r>
+                                      <w:rPr>
+                                        <w:b/>
+                                        <w:sz w:val="32"/>
+                                        <w:szCs w:val="32"/>
+                                      </w:rPr>
+                                      <w:t>................................KGS</w:t>
+                                    </w:r>
+                                  </w:p>
+                                  <w:p>
+                                    <w:pPr>
+                                      <w:spacing w:line="240" w:lineRule="auto"/>
+                                      <w:rPr>
+                                        <w:b/>
+                                        <w:sz w:val="32"/>
+                                        <w:szCs w:val="32"/>
+                                      </w:rPr>
+                                    </w:pPr>
+                                    <w:r>
+                                      <w:rPr>
+                                        <w:b/>
+                                        <w:sz w:val="48"/>
+                                        <w:szCs w:val="48"/>
+                                      </w:rPr>
+                                      <w:t>1_lot }}</w:t>
                                     </w:r>
                                     <w:r>
                                       <w:rPr>
@@ -3451,6 +3449,16 @@
                                   <w:sz w:val="96"/>
                                   <w:szCs w:val="96"/>
                                 </w:rPr>
+                                <w:t>{{slot1_nama}}</w:t>
+                              </w:r>
+                              <w:r>
+                                <w:rPr>
+                                  <w:rFonts w:ascii="Aptos Black" w:hAnsi="Aptos Black"/>
+                                  <w:b/>
+                                  <w:bCs/>
+                                  <w:sz w:val="96"/>
+                                  <w:szCs w:val="96"/>
+                                </w:rPr>
                                 <w:fldChar w:fldCharType="begin"/>
                               </w:r>
                               <w:r>
@@ -3561,15 +3569,7 @@
                                   <w:sz w:val="48"/>
                                   <w:szCs w:val="48"/>
                                 </w:rPr>
-                                <w:t xml:space="preserve"> </w:t>
-                              </w:r>
-                              <w:r>
-                                <w:rPr>
-                                  <w:b/>
-                                  <w:sz w:val="48"/>
-                                  <w:szCs w:val="48"/>
-                                </w:rPr>
-                                <w:t>{{ slot1_tipe }}</w:t>
+                                <w:t>{{slot1_tipe}}</w:t>
                               </w:r>
                               <w:r>
                                 <w:rPr>
@@ -3635,7 +3635,65 @@
                                   <w:sz w:val="48"/>
                                   <w:szCs w:val="48"/>
                                 </w:rPr>
-                                <w:t xml:space="preserve"> </w:t>
+                                <w:t>{{slot1_lot}}</w:t>
+                              </w:r>
+                              <w:r>
+                                <w:rPr>
+                                  <w:b/>
+                                  <w:sz w:val="32"/>
+                                  <w:szCs w:val="32"/>
+                                </w:rPr>
+                                <w:t>.......................................</w:t>
+                              </w:r>
+                              <w:r>
+                                <w:rPr>
+                                  <w:b/>
+                                  <w:sz w:val="32"/>
+                                  <w:szCs w:val="32"/>
+                                </w:rPr>
+                                <w:t>..............</w:t>
+                              </w:r>
+                              <w:r>
+                                <w:rPr>
+                                  <w:b/>
+                                  <w:sz w:val="32"/>
+                                  <w:szCs w:val="32"/>
+                                </w:rPr>
+                                <w:t>.</w:t>
+                              </w:r>
+                            </w:p>
+                            <w:p>
+                              <w:pPr>
+                                <w:spacing w:line="240" w:lineRule="auto"/>
+                                <w:rPr>
+                                  <w:b/>
+                                  <w:sz w:val="32"/>
+                                  <w:szCs w:val="32"/>
+                                </w:rPr>
+                              </w:pPr>
+                              <w:r>
+                                <w:rPr>
+                                  <w:b/>
+                                  <w:sz w:val="32"/>
+                                  <w:szCs w:val="32"/>
+                                </w:rPr>
+                                <w:t>NET  : ................................</w:t>
+                              </w:r>
+                              <w:r>
+                                <w:rPr>
+                                  <w:b/>
+                                  <w:sz w:val="32"/>
+                                  <w:szCs w:val="32"/>
+                                </w:rPr>
+                                <w:t>................</w:t>
+                              </w:r>
+                              <w:r>
+                                <w:rPr>
+                                  <w:b/>
+                                  <w:sz w:val="32"/>
+                                  <w:szCs w:val="32"/>
+                                </w:rPr>
+                                <w:t>.....</w:t>
                               </w:r>
                               <w:r>
                                 <w:rPr>
@@ -3643,7 +3701,49 @@
                                   <w:sz w:val="48"/>
                                   <w:szCs w:val="48"/>
                                 </w:rPr>
-                                <w:t>{{ slot1_lot }}</w:t>
+                                <w:t>{{slot1_net}}</w:t>
+                              </w:r>
+                              <w:r>
+                                <w:rPr>
+                                  <w:b/>
+                                  <w:sz w:val="32"/>
+                                  <w:szCs w:val="32"/>
+                                </w:rPr>
+                                <w:t>...........</w:t>
+                              </w:r>
+                              <w:r>
+                                <w:rPr>
+                                  <w:b/>
+                                  <w:sz w:val="32"/>
+                                  <w:szCs w:val="32"/>
+                                </w:rPr>
+                                <w:t>.............</w:t>
+                              </w:r>
+                              <w:r>
+                                <w:rPr>
+                                  <w:b/>
+                                  <w:sz w:val="32"/>
+                                  <w:szCs w:val="32"/>
+                                </w:rPr>
+                                <w:t>................................KGS</w:t>
+                              </w:r>
+                            </w:p>
+                            <w:p>
+                              <w:pPr>
+                                <w:spacing w:line="240" w:lineRule="auto"/>
+                                <w:rPr>
+                                  <w:b/>
+                                  <w:sz w:val="32"/>
+                                  <w:szCs w:val="32"/>
+                                </w:rPr>
+                              </w:pPr>
+                              <w:r>
+                                <w:rPr>
+                                  <w:b/>
+                                  <w:sz w:val="48"/>
+                                  <w:szCs w:val="48"/>
+                                </w:rPr>
+                                <w:t>1_lot }}</w:t>
                               </w:r>
                               <w:r>
                                 <w:rPr>
@@ -3773,353 +3873,6 @@
     </w:tbl>
     <w:p>
       <w:pPr>
-        <w:spacing w:line="240" w:lineRule="auto"/>
-        <w:rPr>
-          <w:b/>
-          <w:bCs/>
-          <w:sz w:val="52"/>
-          <w:szCs w:val="52"/>
-        </w:rPr>
-      </w:pPr>
-    </w:p>
-    <w:p>
-      <w:pPr>
-        <w:ind w:left="2693"/>
-        <w:rPr>
-          <w:sz w:val="40"/>
-          <w:szCs w:val="40"/>
-        </w:rPr>
-      </w:pPr>
-    </w:p>
-    <w:p>
-      <w:pPr>
-        <w:spacing w:after="120" w:line="240" w:lineRule="auto"/>
-        <w:jc w:val="center"/>
-        <w:rPr>
-          <w:rFonts w:ascii="Aptos Black" w:hAnsi="Aptos Black"/>
-          <w:b/>
-          <w:bCs/>
-          <w:sz w:val="32"/>
-          <w:szCs w:val="32"/>
-        </w:rPr>
-      </w:pPr>
-    </w:p>
-    <w:p>
-      <w:pPr>
-        <w:spacing w:after="120" w:line="360" w:lineRule="auto"/>
-        <w:jc w:val="center"/>
-        <w:rPr>
-          <w:rFonts w:ascii="Aptos Black" w:hAnsi="Aptos Black"/>
-          <w:b/>
-          <w:bCs/>
-          <w:sz w:val="96"/>
-          <w:szCs w:val="96"/>
-        </w:rPr>
-      </w:pPr>
-      <w:r>
-        <w:rPr>
-          <w:rFonts w:ascii="Aptos Black" w:hAnsi="Aptos Black"/>
-          <w:b/>
-          <w:bCs/>
-          <w:sz w:val="96"/>
-          <w:szCs w:val="96"/>
-        </w:rPr>
-        <w:fldChar w:fldCharType="begin"/>
-      </w:r>
-      <w:r>
-        <w:rPr>
-          <w:rFonts w:ascii="Aptos Black" w:hAnsi="Aptos Black"/>
-          <w:b/>
-          <w:bCs/>
-          <w:sz w:val="96"/>
-          <w:szCs w:val="96"/>
-        </w:rPr>
-        <w:instrText>{ slot1_nama</w:instrText>
-      </w:r>
-      <w:r>
-        <w:rPr>
-          <w:rFonts w:ascii="Aptos Black" w:hAnsi="Aptos Black"/>
-          <w:b/>
-          <w:bCs/>
-          <w:sz w:val="96"/>
-          <w:szCs w:val="96"/>
-        </w:rPr>
-        <w:instrText xml:space="preserve">  </w:instrText>
-      </w:r>
-      <w:r>
-        <w:rPr>
-          <w:rFonts w:ascii="Aptos Black" w:hAnsi="Aptos Black"/>
-          <w:b/>
-          <w:bCs/>
-          <w:sz w:val="96"/>
-          <w:szCs w:val="96"/>
-        </w:rPr>
-        <w:instrText>}</w:instrText>
-      </w:r>
-      <w:r>
-        <w:rPr>
-          <w:rFonts w:ascii="Aptos Black" w:hAnsi="Aptos Black"/>
-          <w:b/>
-          <w:bCs/>
-          <w:sz w:val="96"/>
-          <w:szCs w:val="96"/>
-        </w:rPr>
-        <w:fldChar w:fldCharType="separate"/>
-      </w:r>
-      <w:r>
-        <w:rPr>
-          <w:rFonts w:ascii="Aptos Black" w:hAnsi="Aptos Black"/>
-          <w:b/>
-          <w:bCs/>
-          <w:sz w:val="96"/>
-          <w:szCs w:val="96"/>
-        </w:rPr>
-        <w:t>GOLDEN YELLOW TB</w:t>
-      </w:r>
-      <w:r>
-        <w:rPr>
-          <w:rFonts w:ascii="Aptos Black" w:hAnsi="Aptos Black"/>
-          <w:b/>
-          <w:bCs/>
-          <w:sz w:val="96"/>
-          <w:szCs w:val="96"/>
-        </w:rPr>
-        <w:fldChar w:fldCharType="end"/>
-      </w:r>
-    </w:p>
-    <w:p>
-      <w:pPr>
-        <w:spacing w:after="120" w:line="240" w:lineRule="auto"/>
-        <w:rPr>
-          <w:b/>
-          <w:sz w:val="32"/>
-          <w:szCs w:val="32"/>
-        </w:rPr>
-      </w:pPr>
-      <w:r>
-        <w:rPr>
-          <w:b/>
-          <w:sz w:val="32"/>
-          <w:szCs w:val="32"/>
-        </w:rPr>
-        <w:t>TYPE : ........</w:t>
-      </w:r>
-      <w:r>
-        <w:rPr>
-          <w:b/>
-          <w:sz w:val="32"/>
-          <w:szCs w:val="32"/>
-        </w:rPr>
-        <w:t>....................</w:t>
-      </w:r>
-      <w:r>
-        <w:rPr>
-          <w:b/>
-          <w:sz w:val="32"/>
-          <w:szCs w:val="32"/>
-        </w:rPr>
-        <w:t>...........................</w:t>
-      </w:r>
-      <w:r>
-        <w:rPr>
-          <w:b/>
-          <w:sz w:val="32"/>
-          <w:szCs w:val="32"/>
-        </w:rPr>
-        <w:t>.</w:t>
-      </w:r>
-      <w:r>
-        <w:rPr>
-          <w:b/>
-          <w:sz w:val="48"/>
-          <w:szCs w:val="48"/>
-        </w:rPr>
-        <w:t xml:space="preserve"> </w:t>
-      </w:r>
-      <w:r>
-        <w:rPr>
-          <w:b/>
-          <w:sz w:val="48"/>
-          <w:szCs w:val="48"/>
-        </w:rPr>
-        <w:t>{{ slot1_tipe }}</w:t>
-      </w:r>
-      <w:r>
-        <w:rPr>
-          <w:b/>
-          <w:sz w:val="32"/>
-          <w:szCs w:val="32"/>
-        </w:rPr>
-        <w:t>.............................</w:t>
-      </w:r>
-      <w:r>
-        <w:rPr>
-          <w:b/>
-          <w:sz w:val="32"/>
-          <w:szCs w:val="32"/>
-        </w:rPr>
-        <w:t>.........</w:t>
-      </w:r>
-      <w:r>
-        <w:rPr>
-          <w:b/>
-          <w:sz w:val="32"/>
-          <w:szCs w:val="32"/>
-        </w:rPr>
-        <w:t>.....................</w:t>
-      </w:r>
-    </w:p>
-    <w:p>
-      <w:pPr>
-        <w:spacing w:line="240" w:lineRule="auto"/>
-        <w:rPr>
-          <w:b/>
-          <w:sz w:val="32"/>
-          <w:szCs w:val="32"/>
-        </w:rPr>
-      </w:pPr>
-      <w:r>
-        <w:rPr>
-          <w:b/>
-          <w:sz w:val="32"/>
-          <w:szCs w:val="32"/>
-        </w:rPr>
-        <w:t>LOT  : ...............</w:t>
-      </w:r>
-      <w:r>
-        <w:rPr>
-          <w:b/>
-          <w:sz w:val="32"/>
-          <w:szCs w:val="32"/>
-        </w:rPr>
-        <w:t>.......................</w:t>
-      </w:r>
-      <w:r>
-        <w:rPr>
-          <w:b/>
-          <w:sz w:val="32"/>
-          <w:szCs w:val="32"/>
-        </w:rPr>
-        <w:t>..........</w:t>
-      </w:r>
-      <w:r>
-        <w:rPr>
-          <w:b/>
-          <w:sz w:val="48"/>
-          <w:szCs w:val="48"/>
-        </w:rPr>
-        <w:t xml:space="preserve"> </w:t>
-      </w:r>
-      <w:r>
-        <w:rPr>
-          <w:b/>
-          <w:sz w:val="48"/>
-          <w:szCs w:val="48"/>
-        </w:rPr>
-        <w:t>{{ slot1_lot }}</w:t>
-      </w:r>
-      <w:r>
-        <w:rPr>
-          <w:b/>
-          <w:sz w:val="32"/>
-          <w:szCs w:val="32"/>
-        </w:rPr>
-        <w:t>.......................................</w:t>
-      </w:r>
-      <w:r>
-        <w:rPr>
-          <w:b/>
-          <w:sz w:val="32"/>
-          <w:szCs w:val="32"/>
-        </w:rPr>
-        <w:t>..............</w:t>
-      </w:r>
-      <w:r>
-        <w:rPr>
-          <w:b/>
-          <w:sz w:val="32"/>
-          <w:szCs w:val="32"/>
-        </w:rPr>
-        <w:t>.</w:t>
-      </w:r>
-    </w:p>
-    <w:p>
-      <w:pPr>
-        <w:spacing w:line="240" w:lineRule="auto"/>
-        <w:rPr>
-          <w:b/>
-          <w:sz w:val="32"/>
-          <w:szCs w:val="32"/>
-        </w:rPr>
-      </w:pPr>
-      <w:r>
-        <w:rPr>
-          <w:b/>
-          <w:sz w:val="32"/>
-          <w:szCs w:val="32"/>
-        </w:rPr>
-        <w:t>NET  : ................................</w:t>
-      </w:r>
-      <w:r>
-        <w:rPr>
-          <w:b/>
-          <w:sz w:val="32"/>
-          <w:szCs w:val="32"/>
-        </w:rPr>
-        <w:t>................</w:t>
-      </w:r>
-      <w:r>
-        <w:rPr>
-          <w:b/>
-          <w:sz w:val="32"/>
-          <w:szCs w:val="32"/>
-        </w:rPr>
-        <w:t>.....</w:t>
-      </w:r>
-      <w:r>
-        <w:rPr>
-          <w:b/>
-          <w:sz w:val="48"/>
-          <w:szCs w:val="48"/>
-        </w:rPr>
-        <w:t xml:space="preserve"> </w:t>
-      </w:r>
-      <w:r>
-        <w:rPr>
-          <w:b/>
-          <w:sz w:val="48"/>
-          <w:szCs w:val="48"/>
-        </w:rPr>
-        <w:t>{{ slot1_net }}</w:t>
-      </w:r>
-      <w:r>
-        <w:rPr>
-          <w:b/>
-          <w:sz w:val="32"/>
-          <w:szCs w:val="32"/>
-        </w:rPr>
-        <w:t>...........</w:t>
-      </w:r>
-      <w:r>
-        <w:rPr>
-          <w:b/>
-          <w:sz w:val="32"/>
-          <w:szCs w:val="32"/>
-        </w:rPr>
-        <w:t>.............</w:t>
-      </w:r>
-      <w:r>
-        <w:rPr>
-          <w:b/>
-          <w:sz w:val="32"/>
-          <w:szCs w:val="32"/>
-        </w:rPr>
-        <w:t>................................KGS</w:t>
-      </w:r>
-    </w:p>
-    <w:p>
-      <w:pPr>
-        <w:pStyle w:val="DaftarParagraf"/>
         <w:rPr>
           <w:sz w:val="18"/>
           <w:szCs w:val="18"/>

</xml_diff>